<commit_message>
memoria actualizada con diagramas
</commit_message>
<xml_diff>
--- a/Memoria_SustraiApp.docx
+++ b/Memoria_SustraiApp.docx
@@ -3537,24 +3537,8 @@
             </w:tcMar>
           </w:tcPr>
           <w:p>
-            <w:pPr>
-              <w:spacing w:after="0" w:line="264" w:lineRule="auto"/>
-              <w:jc w:val="left"/>
-              <w:rPr/>
-            </w:pPr>
-            <w:r>
-              <w:rPr>
-                <w:b w:val="0"/>
-                <w:bCs w:val="0"/>
-                <w:color w:val="1b1b1f"/>
-                <w:rtl w:val="0"/>
-              </w:rPr>
-              <w:t xml:space="preserve">Recomendación personalizada y asistencia mediante el chatbot de la API de Data Science.</w:t>
-            </w:r>
-            <w:r>
-              <w:rPr>
-                <w:rtl w:val="0"/>
-              </w:rPr>
+            <w:r>
+              <w:t>Asistente conversacional (chatbot) disponible en todas las páginas como FAB flotante. Detecta intención (gastronomía, cultura, eventos) y ubicación en lenguaje natural. Retorna una lista de ítems navegables con valoración estimada. Funciona sin sesión (sin personalización) y con sesión autenticada (cabecera X-User-Id para personalización futura).</w:t>
             </w:r>
           </w:p>
         </w:tc>
@@ -3759,6 +3743,28 @@
               <w:rPr>
                 <w:rtl w:val="0"/>
               </w:rPr>
+            </w:r>
+          </w:p>
+        </w:tc>
+      </w:tr>
+      <w:tr>
+        <w:tc>
+          <w:tcPr>
+            <w:tcW w:type="dxa" w:w="1500"/>
+          </w:tcPr>
+          <w:p>
+            <w:r>
+              <w:t>RF-08</w:t>
+            </w:r>
+          </w:p>
+        </w:tc>
+        <w:tc>
+          <w:tcPr>
+            <w:tcW w:type="dxa" w:w="7526"/>
+          </w:tcPr>
+          <w:p>
+            <w:r>
+              <w:t>Gestión de contenido en el panel de administración con pestañas independientes para Gastronomía, Cultura y Eventos; búsqueda por nombre; filtro por categoría; y toggles para activar/desactivar y para marcar como patrocinado (is_sponsored) cada ítem.</w:t>
             </w:r>
           </w:p>
         </w:tc>
@@ -6577,6 +6583,390 @@
         <w:rPr>
           <w:rtl w:val="0"/>
         </w:rPr>
+      </w:r>
+    </w:p>
+    <w:p>
+      <w:r>
+        <w:br w:type="page"/>
+      </w:r>
+    </w:p>
+    <w:p>
+      <w:pPr>
+        <w:pStyle w:val="Heading1"/>
+      </w:pPr>
+      <w:r>
+        <w:t>2  Diseño y Arquitectura</w:t>
+      </w:r>
+    </w:p>
+    <w:p>
+      <w:pPr>
+        <w:pStyle w:val="Heading2"/>
+      </w:pPr>
+      <w:r>
+        <w:t>2.1  Arquitectura general</w:t>
+      </w:r>
+    </w:p>
+    <w:p>
+      <w:pPr/>
+      <w:r>
+        <w:t>SustraiApp sigue una arquitectura de tres capas diferenciadas con una capa adicional de ciencia de datos:</w:t>
+      </w:r>
+    </w:p>
+    <w:p>
+      <w:pPr/>
+      <w:r>
+        <w:t>• Frontend SPA (React + Vite): interfaz de usuario servida estáticamente, comunica con el backend mediante la API REST y con la capa de DS a través del proxy del backend.</w:t>
+      </w:r>
+    </w:p>
+    <w:p>
+      <w:pPr/>
+      <w:r>
+        <w:t>• Backend Node.js + Express: API REST con autenticación JWT (httpOnly cookie), lógica de negocio, acceso a PostgreSQL vía Sequelize y proxy hacia la API de Data Science.</w:t>
+      </w:r>
+    </w:p>
+    <w:p>
+      <w:pPr/>
+      <w:r>
+        <w:t>• Base de datos PostgreSQL: almacena usuarios, favoritos, municipios, negocios de gastronomía, cultura y eventos.</w:t>
+      </w:r>
+    </w:p>
+    <w:p>
+      <w:pPr/>
+      <w:r>
+        <w:t>• API de Data Science (Flask/Python): expone los endpoints de recomendación, listado y el chatbot asistente; conecta a la misma base de datos PostgreSQL.</w:t>
+      </w:r>
+    </w:p>
+    <w:p>
+      <w:pPr>
+        <w:pStyle w:val="Heading2"/>
+      </w:pPr>
+      <w:r>
+        <w:t>2.2  Modelo de datos principal</w:t>
+      </w:r>
+    </w:p>
+    <w:p>
+      <w:pPr/>
+      <w:r>
+        <w:t>Las entidades centrales son: Usuario (autenticación y perfil), Municipio (lookup geográfico), Gastronomia, Cultura y Evento (contenido), Favorite (relación usuario-ítem), GastronomyQualification/Qualification (distinciones Michelin/Repsol), UserInteres/Interes (intereses del usuario para personalización).</w:t>
+      </w:r>
+    </w:p>
+    <w:p>
+      <w:pPr/>
+      <w:r>
+        <w:t>Los modelos de contenido (Gastronomia, Cultura, Evento) comparten los campos active (visibilidad) e is_sponsored (promoción destacada), gestionados desde el panel de administración.</w:t>
+      </w:r>
+    </w:p>
+    <w:p>
+      <w:pPr>
+        <w:pStyle w:val="Heading2"/>
+      </w:pPr>
+      <w:r>
+        <w:t>2.3  Flujo de datos del chatbot</w:t>
+      </w:r>
+    </w:p>
+    <w:p>
+      <w:pPr/>
+      <w:r>
+        <w:t>El chatbot sigue un flujo de tres saltos: (1) el Frontend envía el mensaje del usuario junto con un session_id al endpoint POST /api/chat del Backend Node.js; (2) el Backend extrae opcionalmente el userId del JWT y hace de proxy hacia el endpoint POST /api/chat de la API Flask (DataV2), adjuntando la cabecera X-User-Id si hay sesión; (3) la lógica Python analiza el texto, consulta la base de datos y devuelve una respuesta estructurada (suggestion, items[], aviso).</w:t>
+      </w:r>
+    </w:p>
+    <w:p>
+      <w:r>
+        <w:br w:type="page"/>
+      </w:r>
+    </w:p>
+    <w:p>
+      <w:pPr>
+        <w:pStyle w:val="Heading1"/>
+      </w:pPr>
+      <w:r>
+        <w:t>3  Implementación</w:t>
+      </w:r>
+    </w:p>
+    <w:p>
+      <w:pPr>
+        <w:pStyle w:val="Heading2"/>
+      </w:pPr>
+      <w:r>
+        <w:t>3.1  Frontend</w:t>
+      </w:r>
+    </w:p>
+    <w:p>
+      <w:pPr>
+        <w:pStyle w:val="Heading3"/>
+      </w:pPr>
+      <w:r>
+        <w:t>3.1.1  Estructura de módulos</w:t>
+      </w:r>
+    </w:p>
+    <w:p>
+      <w:pPr/>
+      <w:r>
+        <w:t>El frontend sigue una organización feature-first bajo src/features/, con una carpeta por dominio (auth, chatbot, culture, events, gastronomy, home, profile, admin, favorite). Los servicios de API residen en src/services/ y los componentes transversales en src/shared/.</w:t>
+      </w:r>
+    </w:p>
+    <w:p>
+      <w:pPr>
+        <w:pStyle w:val="Heading3"/>
+      </w:pPr>
+      <w:r>
+        <w:t>3.1.2  Chatbot (Chatbot.jsx)</w:t>
+      </w:r>
+    </w:p>
+    <w:p>
+      <w:pPr/>
+      <w:r>
+        <w:t>El asistente conversacional se implementa como un componente flotante accesible desde cualquier página de la aplicación (FAB con aria-haspopup="dialog"). Su comportamiento:</w:t>
+      </w:r>
+    </w:p>
+    <w:p>
+      <w:pPr/>
+      <w:r>
+        <w:t>• Un botón circular fijo (chatbot__fab) abre un panel tipo dialog (role="dialog", aria-modal="true") con cabecera, área de mensajes y formulario de envío.</w:t>
+      </w:r>
+    </w:p>
+    <w:p>
+      <w:pPr/>
+      <w:r>
+        <w:t>• Cada turno de conversación añade una burbuja de usuario y una de asistente. La respuesta del asistente puede incluir un texto de sugerencia, una lista de ítems recomendados y un aviso opcional.</w:t>
+      </w:r>
+    </w:p>
+    <w:p>
+      <w:pPr/>
+      <w:r>
+        <w:t>• Cada ítem de la lista es un botón navegable: al pulsarlo cierra el panel y navega a la ruta correspondiente (/gastronomy/:id, /culture/:id o /events/:id) según el campo subtipo del ítem (gastro, cultura, evento).</w:t>
+      </w:r>
+    </w:p>
+    <w:p>
+      <w:pPr/>
+      <w:r>
+        <w:t>• Mientras se espera respuesta se muestra un indicador de escritura animado (chatbot__typing). El campo de texto y el botón de envío se deshabilitan durante la carga.</w:t>
+      </w:r>
+    </w:p>
+    <w:p>
+      <w:pPr/>
+      <w:r>
+        <w:t>• El session_id se genera una vez al cargar la aplicación (session-&lt;timestamp&gt;), lo que permite en el futuro mantener el contexto conversacional en la capa de Data Science.</w:t>
+      </w:r>
+    </w:p>
+    <w:p>
+      <w:pPr/>
+      <w:r>
+        <w:t>• Cumple WCAG 2.1 AA: foco gestionado al abrir el panel, aria-live="polite" en el área de mensajes, etiquetas aria-label en todos los controles.</w:t>
+      </w:r>
+    </w:p>
+    <w:p>
+      <w:pPr>
+        <w:pStyle w:val="Heading3"/>
+      </w:pPr>
+      <w:r>
+        <w:t>3.1.3  Servicio de chat (chat.api.js)</w:t>
+      </w:r>
+    </w:p>
+    <w:p>
+      <w:pPr/>
+      <w:r>
+        <w:t>El módulo src/services/chat.api.js expone la función sendMessage({ message, sessionId }) que realiza un POST a /api/chat con credentials: "include" para enviar la cookie de sesión, lo que permite al backend proxy identificar al usuario autenticado. En caso de error de red o de servidor lanza una excepción que el componente Chatbot captura y muestra como mensaje de error amigable.</w:t>
+      </w:r>
+    </w:p>
+    <w:p>
+      <w:pPr>
+        <w:pStyle w:val="Heading3"/>
+      </w:pPr>
+      <w:r>
+        <w:t>3.1.4  Panel de administración – Gestión de contenido (AdminComerciosPage.jsx)</w:t>
+      </w:r>
+    </w:p>
+    <w:p>
+      <w:pPr/>
+      <w:r>
+        <w:t>La página /admin/comercios centraliza la gestión de los tres tipos de contenido en una única interfaz con pestañas (Gastronomía, Cultura, Eventos). Características principales:</w:t>
+      </w:r>
+    </w:p>
+    <w:p>
+      <w:pPr/>
+      <w:r>
+        <w:t>• Carga diferida por pestaña: la primera vez que se activa una pestaña se lanza la petición al API correspondiente (getComercio, getCultura, getEventos). Las siguientes visitas usan el estado ya cargado (loadedTabs).</w:t>
+      </w:r>
+    </w:p>
+    <w:p>
+      <w:pPr/>
+      <w:r>
+        <w:t>• Búsqueda en tiempo real por nombre y filtro por categoría (tipo_comida, tipo_lugar o type según la pestaña activa) calculados con useMemo para evitar recálculos innecesarios.</w:t>
+      </w:r>
+    </w:p>
+    <w:p>
+      <w:pPr/>
+      <w:r>
+        <w:t>• Cada ítem muestra: nombre, municipio, badge de estado (Activo/Inactivo), badge de tipo de categoría y badge de Patrocinado (si aplica).</w:t>
+      </w:r>
+    </w:p>
+    <w:p>
+      <w:pPr/>
+      <w:r>
+        <w:t>• Dos toggles de acción por ítem: (1) Activar/Desactivar (campo active) y (2) Patrocinar/Quitar patrocinio (campo is_sponsored). Ambas actualizaciones son optimistas: el estado local se actualiza en cuanto el servidor confirma el cambio.</w:t>
+      </w:r>
+    </w:p>
+    <w:p>
+      <w:pPr/>
+      <w:r>
+        <w:t>• Acceso restringido a rol admin; cualquier usuario sin ese rol es redirigido a la página principal al cargar el componente.</w:t>
+      </w:r>
+    </w:p>
+    <w:p>
+      <w:pPr>
+        <w:pStyle w:val="Heading2"/>
+      </w:pPr>
+      <w:r>
+        <w:t>3.2  Backend Node.js</w:t>
+      </w:r>
+    </w:p>
+    <w:p>
+      <w:pPr>
+        <w:pStyle w:val="Heading3"/>
+      </w:pPr>
+      <w:r>
+        <w:t>3.2.1  Proxy del chatbot (chat.routes.js)</w:t>
+      </w:r>
+    </w:p>
+    <w:p>
+      <w:pPr/>
+      <w:r>
+        <w:t>El endpoint POST /api/chat actúa como proxy seguro hacia la API de Data Science:</w:t>
+      </w:r>
+    </w:p>
+    <w:p>
+      <w:pPr/>
+      <w:r>
+        <w:t>• Valida que el cuerpo de la petición contenga el campo message.</w:t>
+      </w:r>
+    </w:p>
+    <w:p>
+      <w:pPr/>
+      <w:r>
+        <w:t>• Intenta leer el JWT de la cookie access_token y decodifica el userId. Si la cookie no existe o el token es inválido el chatbot sigue funcionando sin personalización (silent failure).</w:t>
+      </w:r>
+    </w:p>
+    <w:p>
+      <w:pPr/>
+      <w:r>
+        <w:t>• Reenvía la petición a la URL configurada en ML_API_URL (por defecto http://localhost:5442/api/chat) con un timeout de 15 segundos, adjuntando la cabecera X-User-Id si hay userId.</w:t>
+      </w:r>
+    </w:p>
+    <w:p>
+      <w:pPr/>
+      <w:r>
+        <w:t>• Propaga el código de estado HTTP de la API de DS, devolviendo el error en formato JSON homogéneo.</w:t>
+      </w:r>
+    </w:p>
+    <w:p>
+      <w:pPr>
+        <w:pStyle w:val="Heading2"/>
+      </w:pPr>
+      <w:r>
+        <w:t>3.3  API de Data Science (DataV2)</w:t>
+      </w:r>
+    </w:p>
+    <w:p>
+      <w:pPr>
+        <w:pStyle w:val="Heading3"/>
+      </w:pPr>
+      <w:r>
+        <w:t>3.3.1  Detección de intención y ubicación (assistant_logic.py)</w:t>
+      </w:r>
+    </w:p>
+    <w:p>
+      <w:pPr/>
+      <w:r>
+        <w:t>La lógica del asistente se implementa completamente en Python sin depender de un LLM externo, lo que garantiza latencia baja y funcionamiento offline:</w:t>
+      </w:r>
+    </w:p>
+    <w:p>
+      <w:pPr/>
+      <w:r>
+        <w:t>• Detección de intención: se clasifican los mensajes en tres categorías (gastro, cultura, evento) mediante listas de palabras clave expandidas (GASTRO_WORDS, CULTURA_WORDS, EVENTO_WORDS). Si el mensaje contiene palabras de intención general (GENERAL_WORDS) o no coincide con ninguna categoría, se activan las tres simultáneamente.</w:t>
+      </w:r>
+    </w:p>
+    <w:p>
+      <w:pPr/>
+      <w:r>
+        <w:t>• Detección de ubicación: en primer lugar se buscan landmarks con nombre propio (Guggenheim, La Concha, San Mamés…) mapeados a (provincia, municipio). Si no hay landmark, se buscan entre más de 50 ciudades y municipios del País Vasco (CITIES) en euskera y castellano, incluyendo apodos coloquiales (Donosti, Bilbo, Sanse).</w:t>
+      </w:r>
+    </w:p>
+    <w:p>
+      <w:pPr/>
+      <w:r>
+        <w:t>• Consulta con fallback geográfico (_query_with_fallback): intenta filtrar primero por municipio (ILIKE), luego por provincia y finalmente devuelve resultados sin filtro geográfico para garantizar que siempre haya respuesta.</w:t>
+      </w:r>
+    </w:p>
+    <w:p>
+      <w:pPr/>
+      <w:r>
+        <w:t>• Los resultados se ordenan por valoración descendente (gastronomía y cultura) o por fecha ascendente (eventos), y solo se devuelven ítems con active=True.</w:t>
+      </w:r>
+    </w:p>
+    <w:p>
+      <w:pPr/>
+      <w:r>
+        <w:t>• La respuesta se estructura como un objeto ChatResponse (Pydantic) con los campos suggestion (texto), items (lista de Item con item_id, nombre, subtipo, categoria, provincia, estrella_prevista) y aviso.</w:t>
+      </w:r>
+    </w:p>
+    <w:p>
+      <w:pPr>
+        <w:pStyle w:val="Heading3"/>
+      </w:pPr>
+      <w:r>
+        <w:t>3.3.2  Endpoint del chatbot (app.py)</w:t>
+      </w:r>
+    </w:p>
+    <w:p>
+      <w:pPr/>
+      <w:r>
+        <w:t>La API Flask expone el endpoint POST /api/chat que recibe { message, session_id } en el cuerpo JSON y la cabecera opcional X-User-Id. Invoca manejar_chat_flask() de assistant_logic.py y devuelve la respuesta serializada en el formato estándar { "data": { suggestion, items, aviso } }. Los errores se registran con el módulo logging y se devuelven como { "error": "..." } con código HTTP 500.</w:t>
+      </w:r>
+    </w:p>
+    <w:p>
+      <w:pPr/>
+      <w:r>
+        <w:t>Además del chatbot, la misma API Flask expone los endpoints de contenido utilizados por el frontend: gastronomía (mejor valorados, Michelin/Repsol, entorno especial, cerca de ti), cultura (museos, patrimonio, visita guiada, cerca de ti) y eventos (esta semana, fin de semana, cerca de ti, en euskera).</w:t>
+      </w:r>
+    </w:p>
+    <w:p>
+      <w:pPr>
+        <w:pStyle w:val="Heading2"/>
+      </w:pPr>
+      <w:r>
+        <w:t>3.4  Seguridad aplicada</w:t>
+      </w:r>
+    </w:p>
+    <w:p>
+      <w:pPr/>
+      <w:r>
+        <w:t>Las medidas de seguridad implementadas en las nuevas funcionalidades son coherentes con las prácticas OWASP definidas en los requerimientos no funcionales:</w:t>
+      </w:r>
+    </w:p>
+    <w:p>
+      <w:pPr/>
+      <w:r>
+        <w:t>• El endpoint del chatbot en el backend Node.js no expone directamente la URL de la API de DS al cliente, evitando que usuarios externos realicen peticiones directas.</w:t>
+      </w:r>
+    </w:p>
+    <w:p>
+      <w:pPr/>
+      <w:r>
+        <w:t>• La lectura del JWT en el proxy del chatbot es silenciosa: un token inválido no genera un error 401 sino que simplemente omite la personalización. Esto evita revelar información de sesión a través del chatbot.</w:t>
+      </w:r>
+    </w:p>
+    <w:p>
+      <w:pPr/>
+      <w:r>
+        <w:t>• El panel de administración valida el rol admin tanto en el cliente (redirección inmediata) como en el servidor (middleware de autenticación en todas las rutas /admin/*).</w:t>
+      </w:r>
+    </w:p>
+    <w:p>
+      <w:pPr/>
+      <w:r>
+        <w:t>• Los toggles de activación y patrocinio pasan por el middleware de autenticación y autorización del backend antes de persistir el cambio en la base de datos.</w:t>
       </w:r>
     </w:p>
     <w:sectPr>

</xml_diff>